<commit_message>
Facture: extras before footer rows, 20000 to HONNORAIRE, MAGASINAGE fix; Mandat: add RC/NIF/agrément fields
</commit_message>
<xml_diff>
--- a/frontend/api/templates/FACTURE TRANSIT.docx
+++ b/frontend/api/templates/FACTURE TRANSIT.docx
@@ -1322,7 +1322,7 @@
                 <w:sz w:val="22"/>
                 <w:lang w:val="fr-FR"/>
               </w:rPr>
-              <w:t>-MAGAZINAGE</w:t>
+              <w:t>-MAGASINAGE</w:t>
             </w:r>
           </w:p>
           <w:p>
@@ -1412,6 +1412,78 @@
               <w:jc w:val="left"/>
               <w:rPr>
                 <w:rFonts w:ascii="Calibri" w:eastAsia="Calibri" w:hAnsi="Calibri" w:cs="Calibri"/>
+                <w:sz w:val="22"/>
+                <w:lang w:val="fr-FR"/>
+              </w:rPr>
+            </w:pPr>
+            <w:r>
+              <w:rPr>
+                <w:rFonts w:ascii="Calibri" w:eastAsia="Calibri" w:hAnsi="Calibri" w:cs="Calibri"/>
+                <w:b/>
+                <w:i/>
+                <w:sz w:val="22"/>
+                <w:lang w:val="fr-FR"/>
+              </w:rPr>
+              <w:t>{%p for e in extras %}</w:t>
+            </w:r>
+          </w:p>
+          <w:p>
+            <w:pPr>
+              <w:tabs>
+                <w:tab w:val="left" w:pos="6345"/>
+              </w:tabs>
+              <w:spacing w:line="280" w:lineRule="exact"/>
+              <w:jc w:val="left"/>
+              <w:rPr>
+                <w:rFonts w:ascii="Calibri" w:eastAsia="Calibri" w:hAnsi="Calibri" w:cs="Calibri"/>
+                <w:sz w:val="22"/>
+                <w:lang w:val="fr-FR"/>
+              </w:rPr>
+            </w:pPr>
+            <w:r>
+              <w:rPr>
+                <w:rFonts w:ascii="Calibri" w:eastAsia="Calibri" w:hAnsi="Calibri" w:cs="Calibri"/>
+                <w:b/>
+                <w:i/>
+                <w:sz w:val="22"/>
+                <w:lang w:val="fr-FR"/>
+              </w:rPr>
+              <w:t>-{{ e.libelle }}</w:t>
+            </w:r>
+          </w:p>
+          <w:p>
+            <w:pPr>
+              <w:tabs>
+                <w:tab w:val="left" w:pos="6345"/>
+              </w:tabs>
+              <w:spacing w:line="280" w:lineRule="exact"/>
+              <w:jc w:val="left"/>
+              <w:rPr>
+                <w:rFonts w:ascii="Calibri" w:eastAsia="Calibri" w:hAnsi="Calibri" w:cs="Calibri"/>
+                <w:sz w:val="22"/>
+                <w:lang w:val="fr-FR"/>
+              </w:rPr>
+            </w:pPr>
+            <w:r>
+              <w:rPr>
+                <w:rFonts w:ascii="Calibri" w:eastAsia="Calibri" w:hAnsi="Calibri" w:cs="Calibri"/>
+                <w:b/>
+                <w:i/>
+                <w:sz w:val="22"/>
+                <w:lang w:val="fr-FR"/>
+              </w:rPr>
+              <w:t>{%p endfor %}</w:t>
+            </w:r>
+          </w:p>
+          <w:p>
+            <w:pPr>
+              <w:tabs>
+                <w:tab w:val="left" w:pos="6345"/>
+              </w:tabs>
+              <w:spacing w:line="280" w:lineRule="exact"/>
+              <w:jc w:val="left"/>
+              <w:rPr>
+                <w:rFonts w:ascii="Calibri" w:eastAsia="Calibri" w:hAnsi="Calibri" w:cs="Calibri"/>
                 <w:b/>
                 <w:i/>
                 <w:sz w:val="22"/>
@@ -1503,78 +1575,6 @@
                 <w:lang w:val="fr-FR"/>
               </w:rPr>
               <w:t>-TIMBRE</w:t>
-            </w:r>
-          </w:p>
-          <w:p>
-            <w:pPr>
-              <w:tabs>
-                <w:tab w:val="left" w:pos="6345"/>
-              </w:tabs>
-              <w:spacing w:line="280" w:lineRule="exact"/>
-              <w:jc w:val="left"/>
-              <w:rPr>
-                <w:rFonts w:ascii="Calibri" w:eastAsia="Calibri" w:hAnsi="Calibri" w:cs="Calibri"/>
-                <w:sz w:val="22"/>
-                <w:lang w:val="fr-FR"/>
-              </w:rPr>
-            </w:pPr>
-            <w:r>
-              <w:rPr>
-                <w:rFonts w:ascii="Calibri" w:eastAsia="Calibri" w:hAnsi="Calibri" w:cs="Calibri"/>
-                <w:b/>
-                <w:i/>
-                <w:sz w:val="22"/>
-                <w:lang w:val="fr-FR"/>
-              </w:rPr>
-              <w:t>{%p for e in extras %}</w:t>
-            </w:r>
-          </w:p>
-          <w:p>
-            <w:pPr>
-              <w:tabs>
-                <w:tab w:val="left" w:pos="6345"/>
-              </w:tabs>
-              <w:spacing w:line="280" w:lineRule="exact"/>
-              <w:jc w:val="left"/>
-              <w:rPr>
-                <w:rFonts w:ascii="Calibri" w:eastAsia="Calibri" w:hAnsi="Calibri" w:cs="Calibri"/>
-                <w:sz w:val="22"/>
-                <w:lang w:val="fr-FR"/>
-              </w:rPr>
-            </w:pPr>
-            <w:r>
-              <w:rPr>
-                <w:rFonts w:ascii="Calibri" w:eastAsia="Calibri" w:hAnsi="Calibri" w:cs="Calibri"/>
-                <w:b/>
-                <w:i/>
-                <w:sz w:val="22"/>
-                <w:lang w:val="fr-FR"/>
-              </w:rPr>
-              <w:t>-{{ e.libelle }}</w:t>
-            </w:r>
-          </w:p>
-          <w:p>
-            <w:pPr>
-              <w:tabs>
-                <w:tab w:val="left" w:pos="6345"/>
-              </w:tabs>
-              <w:spacing w:line="280" w:lineRule="exact"/>
-              <w:jc w:val="left"/>
-              <w:rPr>
-                <w:rFonts w:ascii="Calibri" w:eastAsia="Calibri" w:hAnsi="Calibri" w:cs="Calibri"/>
-                <w:sz w:val="22"/>
-                <w:lang w:val="fr-FR"/>
-              </w:rPr>
-            </w:pPr>
-            <w:r>
-              <w:rPr>
-                <w:rFonts w:ascii="Calibri" w:eastAsia="Calibri" w:hAnsi="Calibri" w:cs="Calibri"/>
-                <w:b/>
-                <w:i/>
-                <w:sz w:val="22"/>
-                <w:lang w:val="fr-FR"/>
-              </w:rPr>
-              <w:t>{%p endfor %}</w:t>
             </w:r>
           </w:p>
         </w:tc>
@@ -1628,7 +1628,7 @@
                 <w:sz w:val="22"/>
                 <w:lang w:val="fr-FR"/>
               </w:rPr>
-              <w:t>{{ deb_magazinage }}</w:t>
+              <w:t>{{ deb_magasinage }}</w:t>
             </w:r>
           </w:p>
           <w:p>
@@ -1686,6 +1686,89 @@
                 <w:lang w:val="fr-FR"/>
               </w:rPr>
               <w:t>{{ deb_surestaries }}</w:t>
+            </w:r>
+          </w:p>
+          <w:p>
+            <w:pPr>
+              <w:spacing w:line="280" w:lineRule="exact"/>
+              <w:jc w:val="left"/>
+              <w:rPr>
+                <w:rFonts w:ascii="Calibri" w:eastAsia="Calibri" w:hAnsi="Calibri" w:cs="Calibri"/>
+                <w:sz w:val="22"/>
+              </w:rPr>
+            </w:pPr>
+            <w:r>
+              <w:rPr>
+                <w:rFonts w:ascii="Calibri" w:eastAsia="Calibri" w:hAnsi="Calibri" w:cs="Calibri"/>
+                <w:sz w:val="22"/>
+              </w:rPr>
+              <w:t>{%p for e in extras %}</w:t>
+            </w:r>
+          </w:p>
+          <w:p>
+            <w:pPr>
+              <w:spacing w:line="280" w:lineRule="exact"/>
+              <w:jc w:val="left"/>
+              <w:rPr>
+                <w:rFonts w:ascii="Calibri" w:eastAsia="Calibri" w:hAnsi="Calibri" w:cs="Calibri"/>
+                <w:sz w:val="22"/>
+                <w:lang w:val="fr-FR"/>
+              </w:rPr>
+            </w:pPr>
+            <w:proofErr w:type="gramStart"/>
+            <w:r>
+              <w:rPr>
+                <w:rFonts w:ascii="Calibri" w:eastAsia="Calibri" w:hAnsi="Calibri" w:cs="Calibri"/>
+                <w:sz w:val="22"/>
+                <w:lang w:val="fr-FR"/>
+              </w:rPr>
+              <w:t xml:space="preserve">{{ </w:t>
+            </w:r>
+            <w:proofErr w:type="spellStart"/>
+            <w:r>
+              <w:rPr>
+                <w:rFonts w:ascii="Calibri" w:eastAsia="Calibri" w:hAnsi="Calibri" w:cs="Calibri"/>
+                <w:sz w:val="22"/>
+                <w:lang w:val="fr-FR"/>
+              </w:rPr>
+              <w:t>e</w:t>
+            </w:r>
+            <w:proofErr w:type="gramEnd"/>
+            <w:r>
+              <w:rPr>
+                <w:rFonts w:ascii="Calibri" w:eastAsia="Calibri" w:hAnsi="Calibri" w:cs="Calibri"/>
+                <w:sz w:val="22"/>
+                <w:lang w:val="fr-FR"/>
+              </w:rPr>
+              <w:t>.debours</w:t>
+            </w:r>
+            <w:proofErr w:type="spellEnd"/>
+            <w:r>
+              <w:rPr>
+                <w:rFonts w:ascii="Calibri" w:eastAsia="Calibri" w:hAnsi="Calibri" w:cs="Calibri"/>
+                <w:sz w:val="22"/>
+                <w:lang w:val="fr-FR"/>
+              </w:rPr>
+              <w:t xml:space="preserve"> }}</w:t>
+            </w:r>
+          </w:p>
+          <w:p>
+            <w:pPr>
+              <w:spacing w:line="280" w:lineRule="exact"/>
+              <w:jc w:val="left"/>
+              <w:rPr>
+                <w:rFonts w:ascii="Calibri" w:eastAsia="Calibri" w:hAnsi="Calibri" w:cs="Calibri"/>
+                <w:sz w:val="22"/>
+                <w:lang w:val="fr-FR"/>
+              </w:rPr>
+            </w:pPr>
+            <w:r>
+              <w:rPr>
+                <w:rFonts w:ascii="Calibri" w:eastAsia="Calibri" w:hAnsi="Calibri" w:cs="Calibri"/>
+                <w:sz w:val="22"/>
+                <w:lang w:val="fr-FR"/>
+              </w:rPr>
+              <w:t>{%p endfor %}</w:t>
             </w:r>
           </w:p>
           <w:p>
@@ -1817,89 +1900,6 @@
                 <w:sz w:val="22"/>
               </w:rPr>
               <w:t xml:space="preserve"> }}</w:t>
-            </w:r>
-          </w:p>
-          <w:p>
-            <w:pPr>
-              <w:spacing w:line="280" w:lineRule="exact"/>
-              <w:jc w:val="left"/>
-              <w:rPr>
-                <w:rFonts w:ascii="Calibri" w:eastAsia="Calibri" w:hAnsi="Calibri" w:cs="Calibri"/>
-                <w:sz w:val="22"/>
-              </w:rPr>
-            </w:pPr>
-            <w:r>
-              <w:rPr>
-                <w:rFonts w:ascii="Calibri" w:eastAsia="Calibri" w:hAnsi="Calibri" w:cs="Calibri"/>
-                <w:sz w:val="22"/>
-              </w:rPr>
-              <w:t>{%p for e in extras %}</w:t>
-            </w:r>
-          </w:p>
-          <w:p>
-            <w:pPr>
-              <w:spacing w:line="280" w:lineRule="exact"/>
-              <w:jc w:val="left"/>
-              <w:rPr>
-                <w:rFonts w:ascii="Calibri" w:eastAsia="Calibri" w:hAnsi="Calibri" w:cs="Calibri"/>
-                <w:sz w:val="22"/>
-                <w:lang w:val="fr-FR"/>
-              </w:rPr>
-            </w:pPr>
-            <w:proofErr w:type="gramStart"/>
-            <w:r>
-              <w:rPr>
-                <w:rFonts w:ascii="Calibri" w:eastAsia="Calibri" w:hAnsi="Calibri" w:cs="Calibri"/>
-                <w:sz w:val="22"/>
-                <w:lang w:val="fr-FR"/>
-              </w:rPr>
-              <w:t xml:space="preserve">{{ </w:t>
-            </w:r>
-            <w:proofErr w:type="spellStart"/>
-            <w:r>
-              <w:rPr>
-                <w:rFonts w:ascii="Calibri" w:eastAsia="Calibri" w:hAnsi="Calibri" w:cs="Calibri"/>
-                <w:sz w:val="22"/>
-                <w:lang w:val="fr-FR"/>
-              </w:rPr>
-              <w:t>e</w:t>
-            </w:r>
-            <w:proofErr w:type="gramEnd"/>
-            <w:r>
-              <w:rPr>
-                <w:rFonts w:ascii="Calibri" w:eastAsia="Calibri" w:hAnsi="Calibri" w:cs="Calibri"/>
-                <w:sz w:val="22"/>
-                <w:lang w:val="fr-FR"/>
-              </w:rPr>
-              <w:t>.debours</w:t>
-            </w:r>
-            <w:proofErr w:type="spellEnd"/>
-            <w:r>
-              <w:rPr>
-                <w:rFonts w:ascii="Calibri" w:eastAsia="Calibri" w:hAnsi="Calibri" w:cs="Calibri"/>
-                <w:sz w:val="22"/>
-                <w:lang w:val="fr-FR"/>
-              </w:rPr>
-              <w:t xml:space="preserve"> }}</w:t>
-            </w:r>
-          </w:p>
-          <w:p>
-            <w:pPr>
-              <w:spacing w:line="280" w:lineRule="exact"/>
-              <w:jc w:val="left"/>
-              <w:rPr>
-                <w:rFonts w:ascii="Calibri" w:eastAsia="Calibri" w:hAnsi="Calibri" w:cs="Calibri"/>
-                <w:sz w:val="22"/>
-                <w:lang w:val="fr-FR"/>
-              </w:rPr>
-            </w:pPr>
-            <w:r>
-              <w:rPr>
-                <w:rFonts w:ascii="Calibri" w:eastAsia="Calibri" w:hAnsi="Calibri" w:cs="Calibri"/>
-                <w:sz w:val="22"/>
-                <w:lang w:val="fr-FR"/>
-              </w:rPr>
-              <w:t>{%p endfor %}</w:t>
             </w:r>
           </w:p>
         </w:tc>
@@ -1972,7 +1972,7 @@
             </w:r>
             <w:proofErr w:type="gramEnd"/>
             <w:r>
-              <w:t>_magazinage</w:t>
+              <w:t>_magasinage</w:t>
             </w:r>
             <w:proofErr w:type="spellEnd"/>
             <w:r>
@@ -2055,6 +2055,89 @@
             <w:proofErr w:type="spellEnd"/>
             <w:r>
               <w:t xml:space="preserve"> }}</w:t>
+            </w:r>
+          </w:p>
+          <w:p>
+            <w:pPr>
+              <w:spacing w:line="280" w:lineRule="exact"/>
+              <w:jc w:val="left"/>
+              <w:rPr>
+                <w:rFonts w:ascii="Calibri" w:eastAsia="Calibri" w:hAnsi="Calibri" w:cs="Calibri"/>
+                <w:sz w:val="22"/>
+              </w:rPr>
+            </w:pPr>
+            <w:r>
+              <w:rPr>
+                <w:rFonts w:ascii="Calibri" w:eastAsia="Calibri" w:hAnsi="Calibri" w:cs="Calibri"/>
+                <w:sz w:val="22"/>
+              </w:rPr>
+              <w:t>{%p for e in extras %}</w:t>
+            </w:r>
+          </w:p>
+          <w:p>
+            <w:pPr>
+              <w:spacing w:line="280" w:lineRule="exact"/>
+              <w:jc w:val="left"/>
+              <w:rPr>
+                <w:rFonts w:ascii="Calibri" w:eastAsia="Calibri" w:hAnsi="Calibri" w:cs="Calibri"/>
+                <w:sz w:val="22"/>
+                <w:lang w:val="fr-FR"/>
+              </w:rPr>
+            </w:pPr>
+            <w:proofErr w:type="gramStart"/>
+            <w:r>
+              <w:rPr>
+                <w:rFonts w:ascii="Calibri" w:eastAsia="Calibri" w:hAnsi="Calibri" w:cs="Calibri"/>
+                <w:sz w:val="22"/>
+                <w:lang w:val="fr-FR"/>
+              </w:rPr>
+              <w:t xml:space="preserve">{{ </w:t>
+            </w:r>
+            <w:proofErr w:type="spellStart"/>
+            <w:r>
+              <w:rPr>
+                <w:rFonts w:ascii="Calibri" w:eastAsia="Calibri" w:hAnsi="Calibri" w:cs="Calibri"/>
+                <w:sz w:val="22"/>
+                <w:lang w:val="fr-FR"/>
+              </w:rPr>
+              <w:t>e</w:t>
+            </w:r>
+            <w:proofErr w:type="gramEnd"/>
+            <w:r>
+              <w:rPr>
+                <w:rFonts w:ascii="Calibri" w:eastAsia="Calibri" w:hAnsi="Calibri" w:cs="Calibri"/>
+                <w:sz w:val="22"/>
+                <w:lang w:val="fr-FR"/>
+              </w:rPr>
+              <w:t>.produit</w:t>
+            </w:r>
+            <w:proofErr w:type="spellEnd"/>
+            <w:r>
+              <w:rPr>
+                <w:rFonts w:ascii="Calibri" w:eastAsia="Calibri" w:hAnsi="Calibri" w:cs="Calibri"/>
+                <w:sz w:val="22"/>
+                <w:lang w:val="fr-FR"/>
+              </w:rPr>
+              <w:t xml:space="preserve"> }}</w:t>
+            </w:r>
+          </w:p>
+          <w:p>
+            <w:pPr>
+              <w:spacing w:line="280" w:lineRule="exact"/>
+              <w:jc w:val="left"/>
+              <w:rPr>
+                <w:rFonts w:ascii="Calibri" w:eastAsia="Calibri" w:hAnsi="Calibri" w:cs="Calibri"/>
+                <w:sz w:val="22"/>
+                <w:lang w:val="fr-FR"/>
+              </w:rPr>
+            </w:pPr>
+            <w:r>
+              <w:rPr>
+                <w:rFonts w:ascii="Calibri" w:eastAsia="Calibri" w:hAnsi="Calibri" w:cs="Calibri"/>
+                <w:sz w:val="22"/>
+                <w:lang w:val="fr-FR"/>
+              </w:rPr>
+              <w:t>{%p endfor %}</w:t>
             </w:r>
           </w:p>
           <w:p>
@@ -2208,89 +2291,6 @@
                 <w:sz w:val="22"/>
               </w:rPr>
               <w:t xml:space="preserve"> }}</w:t>
-            </w:r>
-          </w:p>
-          <w:p>
-            <w:pPr>
-              <w:spacing w:line="280" w:lineRule="exact"/>
-              <w:jc w:val="left"/>
-              <w:rPr>
-                <w:rFonts w:ascii="Calibri" w:eastAsia="Calibri" w:hAnsi="Calibri" w:cs="Calibri"/>
-                <w:sz w:val="22"/>
-              </w:rPr>
-            </w:pPr>
-            <w:r>
-              <w:rPr>
-                <w:rFonts w:ascii="Calibri" w:eastAsia="Calibri" w:hAnsi="Calibri" w:cs="Calibri"/>
-                <w:sz w:val="22"/>
-              </w:rPr>
-              <w:t>{%p for e in extras %}</w:t>
-            </w:r>
-          </w:p>
-          <w:p>
-            <w:pPr>
-              <w:spacing w:line="280" w:lineRule="exact"/>
-              <w:jc w:val="left"/>
-              <w:rPr>
-                <w:rFonts w:ascii="Calibri" w:eastAsia="Calibri" w:hAnsi="Calibri" w:cs="Calibri"/>
-                <w:sz w:val="22"/>
-                <w:lang w:val="fr-FR"/>
-              </w:rPr>
-            </w:pPr>
-            <w:proofErr w:type="gramStart"/>
-            <w:r>
-              <w:rPr>
-                <w:rFonts w:ascii="Calibri" w:eastAsia="Calibri" w:hAnsi="Calibri" w:cs="Calibri"/>
-                <w:sz w:val="22"/>
-                <w:lang w:val="fr-FR"/>
-              </w:rPr>
-              <w:t xml:space="preserve">{{ </w:t>
-            </w:r>
-            <w:proofErr w:type="spellStart"/>
-            <w:r>
-              <w:rPr>
-                <w:rFonts w:ascii="Calibri" w:eastAsia="Calibri" w:hAnsi="Calibri" w:cs="Calibri"/>
-                <w:sz w:val="22"/>
-                <w:lang w:val="fr-FR"/>
-              </w:rPr>
-              <w:t>e</w:t>
-            </w:r>
-            <w:proofErr w:type="gramEnd"/>
-            <w:r>
-              <w:rPr>
-                <w:rFonts w:ascii="Calibri" w:eastAsia="Calibri" w:hAnsi="Calibri" w:cs="Calibri"/>
-                <w:sz w:val="22"/>
-                <w:lang w:val="fr-FR"/>
-              </w:rPr>
-              <w:t>.produit</w:t>
-            </w:r>
-            <w:proofErr w:type="spellEnd"/>
-            <w:r>
-              <w:rPr>
-                <w:rFonts w:ascii="Calibri" w:eastAsia="Calibri" w:hAnsi="Calibri" w:cs="Calibri"/>
-                <w:sz w:val="22"/>
-                <w:lang w:val="fr-FR"/>
-              </w:rPr>
-              <w:t xml:space="preserve"> }}</w:t>
-            </w:r>
-          </w:p>
-          <w:p>
-            <w:pPr>
-              <w:spacing w:line="280" w:lineRule="exact"/>
-              <w:jc w:val="left"/>
-              <w:rPr>
-                <w:rFonts w:ascii="Calibri" w:eastAsia="Calibri" w:hAnsi="Calibri" w:cs="Calibri"/>
-                <w:sz w:val="22"/>
-                <w:lang w:val="fr-FR"/>
-              </w:rPr>
-            </w:pPr>
-            <w:r>
-              <w:rPr>
-                <w:rFonts w:ascii="Calibri" w:eastAsia="Calibri" w:hAnsi="Calibri" w:cs="Calibri"/>
-                <w:sz w:val="22"/>
-                <w:lang w:val="fr-FR"/>
-              </w:rPr>
-              <w:t>{%p endfor %}</w:t>
             </w:r>
           </w:p>
         </w:tc>
@@ -2344,7 +2344,7 @@
                 <w:sz w:val="22"/>
                 <w:lang w:val="fr-FR"/>
               </w:rPr>
-              <w:t>{{ obs_magazinage }}</w:t>
+              <w:t>{{ obs_magasinage }}</w:t>
             </w:r>
           </w:p>
           <w:p>
@@ -2411,6 +2411,89 @@
               <w:rPr>
                 <w:rFonts w:ascii="Calibri" w:eastAsia="Calibri" w:hAnsi="Calibri" w:cs="Calibri"/>
                 <w:sz w:val="22"/>
+              </w:rPr>
+            </w:pPr>
+            <w:r>
+              <w:rPr>
+                <w:rFonts w:ascii="Calibri" w:eastAsia="Calibri" w:hAnsi="Calibri" w:cs="Calibri"/>
+                <w:sz w:val="22"/>
+              </w:rPr>
+              <w:t>{%p for e in extras %}</w:t>
+            </w:r>
+          </w:p>
+          <w:p>
+            <w:pPr>
+              <w:spacing w:line="280" w:lineRule="exact"/>
+              <w:jc w:val="left"/>
+              <w:rPr>
+                <w:rFonts w:ascii="Calibri" w:eastAsia="Calibri" w:hAnsi="Calibri" w:cs="Calibri"/>
+                <w:sz w:val="22"/>
+                <w:lang w:val="fr-FR"/>
+              </w:rPr>
+            </w:pPr>
+            <w:proofErr w:type="gramStart"/>
+            <w:r>
+              <w:rPr>
+                <w:rFonts w:ascii="Calibri" w:eastAsia="Calibri" w:hAnsi="Calibri" w:cs="Calibri"/>
+                <w:sz w:val="22"/>
+                <w:lang w:val="fr-FR"/>
+              </w:rPr>
+              <w:t xml:space="preserve">{{ </w:t>
+            </w:r>
+            <w:proofErr w:type="spellStart"/>
+            <w:r>
+              <w:rPr>
+                <w:rFonts w:ascii="Calibri" w:eastAsia="Calibri" w:hAnsi="Calibri" w:cs="Calibri"/>
+                <w:sz w:val="22"/>
+                <w:lang w:val="fr-FR"/>
+              </w:rPr>
+              <w:t>e</w:t>
+            </w:r>
+            <w:proofErr w:type="gramEnd"/>
+            <w:r>
+              <w:rPr>
+                <w:rFonts w:ascii="Calibri" w:eastAsia="Calibri" w:hAnsi="Calibri" w:cs="Calibri"/>
+                <w:sz w:val="22"/>
+                <w:lang w:val="fr-FR"/>
+              </w:rPr>
+              <w:t>.observation</w:t>
+            </w:r>
+            <w:proofErr w:type="spellEnd"/>
+            <w:r>
+              <w:rPr>
+                <w:rFonts w:ascii="Calibri" w:eastAsia="Calibri" w:hAnsi="Calibri" w:cs="Calibri"/>
+                <w:sz w:val="22"/>
+                <w:lang w:val="fr-FR"/>
+              </w:rPr>
+              <w:t xml:space="preserve"> }}</w:t>
+            </w:r>
+          </w:p>
+          <w:p>
+            <w:pPr>
+              <w:spacing w:line="280" w:lineRule="exact"/>
+              <w:jc w:val="left"/>
+              <w:rPr>
+                <w:rFonts w:ascii="Calibri" w:eastAsia="Calibri" w:hAnsi="Calibri" w:cs="Calibri"/>
+                <w:sz w:val="22"/>
+                <w:lang w:val="fr-FR"/>
+              </w:rPr>
+            </w:pPr>
+            <w:r>
+              <w:rPr>
+                <w:rFonts w:ascii="Calibri" w:eastAsia="Calibri" w:hAnsi="Calibri" w:cs="Calibri"/>
+                <w:sz w:val="22"/>
+                <w:lang w:val="fr-FR"/>
+              </w:rPr>
+              <w:t>{%p endfor %}</w:t>
+            </w:r>
+          </w:p>
+          <w:p>
+            <w:pPr>
+              <w:spacing w:line="280" w:lineRule="exact"/>
+              <w:jc w:val="left"/>
+              <w:rPr>
+                <w:rFonts w:ascii="Calibri" w:eastAsia="Calibri" w:hAnsi="Calibri" w:cs="Calibri"/>
+                <w:sz w:val="22"/>
                 <w:lang w:val="fr-FR"/>
               </w:rPr>
             </w:pPr>
@@ -2501,89 +2584,6 @@
                 <w:sz w:val="22"/>
               </w:rPr>
               <w:t xml:space="preserve"> }}</w:t>
-            </w:r>
-          </w:p>
-          <w:p>
-            <w:pPr>
-              <w:spacing w:line="280" w:lineRule="exact"/>
-              <w:jc w:val="left"/>
-              <w:rPr>
-                <w:rFonts w:ascii="Calibri" w:eastAsia="Calibri" w:hAnsi="Calibri" w:cs="Calibri"/>
-                <w:sz w:val="22"/>
-              </w:rPr>
-            </w:pPr>
-            <w:r>
-              <w:rPr>
-                <w:rFonts w:ascii="Calibri" w:eastAsia="Calibri" w:hAnsi="Calibri" w:cs="Calibri"/>
-                <w:sz w:val="22"/>
-              </w:rPr>
-              <w:t>{%p for e in extras %}</w:t>
-            </w:r>
-          </w:p>
-          <w:p>
-            <w:pPr>
-              <w:spacing w:line="280" w:lineRule="exact"/>
-              <w:jc w:val="left"/>
-              <w:rPr>
-                <w:rFonts w:ascii="Calibri" w:eastAsia="Calibri" w:hAnsi="Calibri" w:cs="Calibri"/>
-                <w:sz w:val="22"/>
-                <w:lang w:val="fr-FR"/>
-              </w:rPr>
-            </w:pPr>
-            <w:proofErr w:type="gramStart"/>
-            <w:r>
-              <w:rPr>
-                <w:rFonts w:ascii="Calibri" w:eastAsia="Calibri" w:hAnsi="Calibri" w:cs="Calibri"/>
-                <w:sz w:val="22"/>
-                <w:lang w:val="fr-FR"/>
-              </w:rPr>
-              <w:t xml:space="preserve">{{ </w:t>
-            </w:r>
-            <w:proofErr w:type="spellStart"/>
-            <w:r>
-              <w:rPr>
-                <w:rFonts w:ascii="Calibri" w:eastAsia="Calibri" w:hAnsi="Calibri" w:cs="Calibri"/>
-                <w:sz w:val="22"/>
-                <w:lang w:val="fr-FR"/>
-              </w:rPr>
-              <w:t>e</w:t>
-            </w:r>
-            <w:proofErr w:type="gramEnd"/>
-            <w:r>
-              <w:rPr>
-                <w:rFonts w:ascii="Calibri" w:eastAsia="Calibri" w:hAnsi="Calibri" w:cs="Calibri"/>
-                <w:sz w:val="22"/>
-                <w:lang w:val="fr-FR"/>
-              </w:rPr>
-              <w:t>.observation</w:t>
-            </w:r>
-            <w:proofErr w:type="spellEnd"/>
-            <w:r>
-              <w:rPr>
-                <w:rFonts w:ascii="Calibri" w:eastAsia="Calibri" w:hAnsi="Calibri" w:cs="Calibri"/>
-                <w:sz w:val="22"/>
-                <w:lang w:val="fr-FR"/>
-              </w:rPr>
-              <w:t xml:space="preserve"> }}</w:t>
-            </w:r>
-          </w:p>
-          <w:p>
-            <w:pPr>
-              <w:spacing w:line="280" w:lineRule="exact"/>
-              <w:jc w:val="left"/>
-              <w:rPr>
-                <w:rFonts w:ascii="Calibri" w:eastAsia="Calibri" w:hAnsi="Calibri" w:cs="Calibri"/>
-                <w:sz w:val="22"/>
-                <w:lang w:val="fr-FR"/>
-              </w:rPr>
-            </w:pPr>
-            <w:r>
-              <w:rPr>
-                <w:rFonts w:ascii="Calibri" w:eastAsia="Calibri" w:hAnsi="Calibri" w:cs="Calibri"/>
-                <w:sz w:val="22"/>
-                <w:lang w:val="fr-FR"/>
-              </w:rPr>
-              <w:t>{%p endfor %}</w:t>
             </w:r>
           </w:p>
         </w:tc>

</xml_diff>